<commit_message>
document update --name and student number update
</commit_message>
<xml_diff>
--- a/Task_1.docx
+++ b/Task_1.docx
@@ -37,30 +37,26 @@
         <w:spacing w:after="40"/>
         <w:rPr>
           <w:rFonts w:ascii="Arial" w:hAnsi="Arial" w:cs="Arial"/>
-        </w:rPr>
-      </w:pPr>
-      <w:r>
-        <w:rPr>
-          <w:rFonts w:ascii="Arial" w:hAnsi="Arial" w:cs="Arial"/>
           <w:b/>
           <w:bCs/>
         </w:rPr>
+      </w:pPr>
+      <w:r>
+        <w:rPr>
+          <w:rFonts w:ascii="Arial" w:hAnsi="Arial" w:cs="Arial"/>
+          <w:b/>
+          <w:bCs/>
+        </w:rPr>
         <w:t>Task 1: Event Concept and Completed Architecture (45 marks)</w:t>
       </w:r>
     </w:p>
     <w:p>
       <w:pPr>
-        <w:spacing w:after="20"/>
-        <w:rPr>
-          <w:rFonts w:ascii="Arial" w:hAnsi="Arial" w:cs="Arial"/>
-        </w:rPr>
-      </w:pPr>
-      <w:r>
-        <w:rPr>
-          <w:rFonts w:ascii="Arial" w:hAnsi="Arial" w:cs="Arial"/>
-        </w:rPr>
-        <w:t>Chitambala Sikazwe (u25173384)</w:t>
-      </w:r>
+        <w:spacing w:after="280"/>
+        <w:rPr>
+          <w:rFonts w:ascii="Arial" w:hAnsi="Arial" w:cs="Arial"/>
+        </w:rPr>
+      </w:pPr>
     </w:p>
     <w:p>
       <w:pPr>
@@ -79,6 +75,12 @@
         <w:rPr>
           <w:rFonts w:ascii="Arial" w:hAnsi="Arial" w:cs="Arial"/>
         </w:rPr>
+        <w:t xml:space="preserve">Chitambala Sikazwe (u25173384), </w:t>
+      </w:r>
+      <w:r>
+        <w:rPr>
+          <w:rFonts w:ascii="Arial" w:hAnsi="Arial" w:cs="Arial"/>
+        </w:rPr>
         <w:t>Gary Mull (u25071247)</w:t>
       </w:r>
       <w:r>
@@ -87,19 +89,29 @@
         </w:rPr>
         <w:t xml:space="preserve">, </w:t>
       </w:r>
-      <w:proofErr w:type="spellStart"/>
       <w:r>
         <w:rPr>
           <w:rFonts w:ascii="Arial" w:hAnsi="Arial" w:cs="Arial"/>
         </w:rPr>
         <w:t>Louwren</w:t>
       </w:r>
-      <w:proofErr w:type="spellEnd"/>
+      <w:r>
+        <w:rPr>
+          <w:rFonts w:ascii="Arial" w:hAnsi="Arial" w:cs="Arial"/>
+        </w:rPr>
+        <w:t>s</w:t>
+      </w:r>
       <w:r>
         <w:rPr>
           <w:rFonts w:ascii="Arial" w:hAnsi="Arial" w:cs="Arial"/>
         </w:rPr>
         <w:t xml:space="preserve"> Johansen</w:t>
+      </w:r>
+      <w:r>
+        <w:rPr>
+          <w:rFonts w:ascii="Arial" w:hAnsi="Arial" w:cs="Arial"/>
+        </w:rPr>
+        <w:t xml:space="preserve"> (u25607414)</w:t>
       </w:r>
     </w:p>
     <w:p>
@@ -559,6 +571,7 @@
         <w:rPr>
           <w:rFonts w:ascii="Arial" w:hAnsi="Arial" w:cs="Arial"/>
         </w:rPr>
+        <w:lastRenderedPageBreak/>
         <w:t>InformationDesk</w:t>
       </w:r>
       <w:proofErr w:type="spellEnd"/>
@@ -581,7 +594,6 @@
         <w:rPr>
           <w:rFonts w:ascii="Arial" w:hAnsi="Arial" w:cs="Arial"/>
         </w:rPr>
-        <w:lastRenderedPageBreak/>
         <w:t xml:space="preserve">On top of this containment tree, </w:t>
       </w:r>
       <w:proofErr w:type="spellStart"/>
@@ -1810,6 +1822,7 @@
               <w:rPr>
                 <w:rFonts w:ascii="Arial" w:hAnsi="Arial" w:cs="Arial"/>
               </w:rPr>
+              <w:lastRenderedPageBreak/>
               <w:t>Observer</w:t>
             </w:r>
           </w:p>
@@ -1942,7 +1955,6 @@
               <w:rPr>
                 <w:rFonts w:ascii="Arial" w:hAnsi="Arial" w:cs="Arial"/>
               </w:rPr>
-              <w:lastRenderedPageBreak/>
               <w:t>Observer</w:t>
             </w:r>
           </w:p>
@@ -2307,6 +2319,7 @@
         <w:rPr>
           <w:rFonts w:ascii="Arial" w:hAnsi="Arial" w:cs="Arial"/>
         </w:rPr>
+        <w:lastRenderedPageBreak/>
         <w:t xml:space="preserve">Multiplicities: one </w:t>
       </w:r>
       <w:proofErr w:type="spellStart"/>
@@ -2377,14 +2390,7 @@
         <w:rPr>
           <w:rFonts w:ascii="Arial" w:hAnsi="Arial" w:cs="Arial"/>
         </w:rPr>
-        <w:t xml:space="preserve">. Every </w:t>
-      </w:r>
-      <w:r>
-        <w:rPr>
-          <w:rFonts w:ascii="Arial" w:hAnsi="Arial" w:cs="Arial"/>
-        </w:rPr>
-        <w:lastRenderedPageBreak/>
-        <w:t>abstract base with a virtual member (</w:t>
+        <w:t>. Every abstract base with a virtual member (</w:t>
       </w:r>
       <w:proofErr w:type="spellStart"/>
       <w:r>
@@ -2924,7 +2930,14 @@
         <w:rPr>
           <w:rFonts w:ascii="Arial" w:hAnsi="Arial" w:cs="Arial"/>
         </w:rPr>
-        <w:t xml:space="preserve"> collaboration with whatever sits below it (it is telling others something). These are two different one-to-many relationships with two different sets of participants, and </w:t>
+        <w:t xml:space="preserve"> collaboration with whatever sits below it (it is telling others something). These are two different one-to-many </w:t>
+      </w:r>
+      <w:r>
+        <w:rPr>
+          <w:rFonts w:ascii="Arial" w:hAnsi="Arial" w:cs="Arial"/>
+        </w:rPr>
+        <w:lastRenderedPageBreak/>
+        <w:t xml:space="preserve">relationships with two different sets of participants, and </w:t>
       </w:r>
       <w:proofErr w:type="spellStart"/>
       <w:r>
@@ -2938,14 +2951,7 @@
         <w:rPr>
           <w:rFonts w:ascii="Arial" w:hAnsi="Arial" w:cs="Arial"/>
         </w:rPr>
-        <w:t xml:space="preserve"> never plays both roles on the same edge of the tree at once, since a notice always flows strictly downward through a chain of otherwise normal Observer/Subject pairs. The dual role is exactly what the brief's own </w:t>
-      </w:r>
-      <w:r>
-        <w:rPr>
-          <w:rFonts w:ascii="Arial" w:hAnsi="Arial" w:cs="Arial"/>
-        </w:rPr>
-        <w:lastRenderedPageBreak/>
-        <w:t>scenario asks for, that "some event areas receive notifications from above and then notify interested units below."</w:t>
+        <w:t xml:space="preserve"> never plays both roles on the same edge of the tree at once, since a notice always flows strictly downward through a chain of otherwise normal Observer/Subject pairs. The dual role is exactly what the brief's own scenario asks for, that "some event areas receive notifications from above and then notify interested units below."</w:t>
       </w:r>
     </w:p>
     <w:sectPr>

</xml_diff>

<commit_message>
update 2 name change
</commit_message>
<xml_diff>
--- a/Task_1.docx
+++ b/Task_1.docx
@@ -37,30 +37,26 @@
         <w:spacing w:after="40"/>
         <w:rPr>
           <w:rFonts w:ascii="Arial" w:hAnsi="Arial" w:cs="Arial"/>
-        </w:rPr>
-      </w:pPr>
-      <w:r>
-        <w:rPr>
-          <w:rFonts w:ascii="Arial" w:hAnsi="Arial" w:cs="Arial"/>
           <w:b/>
           <w:bCs/>
         </w:rPr>
+      </w:pPr>
+      <w:r>
+        <w:rPr>
+          <w:rFonts w:ascii="Arial" w:hAnsi="Arial" w:cs="Arial"/>
+          <w:b/>
+          <w:bCs/>
+        </w:rPr>
         <w:t>Task 1: Event Concept and Completed Architecture (45 marks)</w:t>
       </w:r>
     </w:p>
     <w:p>
       <w:pPr>
-        <w:spacing w:after="20"/>
-        <w:rPr>
-          <w:rFonts w:ascii="Arial" w:hAnsi="Arial" w:cs="Arial"/>
-        </w:rPr>
-      </w:pPr>
-      <w:r>
-        <w:rPr>
-          <w:rFonts w:ascii="Arial" w:hAnsi="Arial" w:cs="Arial"/>
-        </w:rPr>
-        <w:t>Chitambala Sikazwe (u25173384)</w:t>
-      </w:r>
+        <w:spacing w:after="280"/>
+        <w:rPr>
+          <w:rFonts w:ascii="Arial" w:hAnsi="Arial" w:cs="Arial"/>
+        </w:rPr>
+      </w:pPr>
     </w:p>
     <w:p>
       <w:pPr>
@@ -79,6 +75,12 @@
         <w:rPr>
           <w:rFonts w:ascii="Arial" w:hAnsi="Arial" w:cs="Arial"/>
         </w:rPr>
+        <w:t xml:space="preserve">Chitambala Sikazwe (u25173384), </w:t>
+      </w:r>
+      <w:r>
+        <w:rPr>
+          <w:rFonts w:ascii="Arial" w:hAnsi="Arial" w:cs="Arial"/>
+        </w:rPr>
         <w:t>Gary Mull (u25071247)</w:t>
       </w:r>
       <w:r>
@@ -87,19 +89,29 @@
         </w:rPr>
         <w:t xml:space="preserve">, </w:t>
       </w:r>
-      <w:proofErr w:type="spellStart"/>
       <w:r>
         <w:rPr>
           <w:rFonts w:ascii="Arial" w:hAnsi="Arial" w:cs="Arial"/>
         </w:rPr>
         <w:t>Louwren</w:t>
       </w:r>
-      <w:proofErr w:type="spellEnd"/>
+      <w:r>
+        <w:rPr>
+          <w:rFonts w:ascii="Arial" w:hAnsi="Arial" w:cs="Arial"/>
+        </w:rPr>
+        <w:t>s</w:t>
+      </w:r>
       <w:r>
         <w:rPr>
           <w:rFonts w:ascii="Arial" w:hAnsi="Arial" w:cs="Arial"/>
         </w:rPr>
         <w:t xml:space="preserve"> Johansen</w:t>
+      </w:r>
+      <w:r>
+        <w:rPr>
+          <w:rFonts w:ascii="Arial" w:hAnsi="Arial" w:cs="Arial"/>
+        </w:rPr>
+        <w:t xml:space="preserve"> (u25607414)</w:t>
       </w:r>
     </w:p>
     <w:p>
@@ -559,6 +571,7 @@
         <w:rPr>
           <w:rFonts w:ascii="Arial" w:hAnsi="Arial" w:cs="Arial"/>
         </w:rPr>
+        <w:lastRenderedPageBreak/>
         <w:t>InformationDesk</w:t>
       </w:r>
       <w:proofErr w:type="spellEnd"/>
@@ -581,7 +594,6 @@
         <w:rPr>
           <w:rFonts w:ascii="Arial" w:hAnsi="Arial" w:cs="Arial"/>
         </w:rPr>
-        <w:lastRenderedPageBreak/>
         <w:t xml:space="preserve">On top of this containment tree, </w:t>
       </w:r>
       <w:proofErr w:type="spellStart"/>
@@ -1810,6 +1822,7 @@
               <w:rPr>
                 <w:rFonts w:ascii="Arial" w:hAnsi="Arial" w:cs="Arial"/>
               </w:rPr>
+              <w:lastRenderedPageBreak/>
               <w:t>Observer</w:t>
             </w:r>
           </w:p>
@@ -1942,7 +1955,6 @@
               <w:rPr>
                 <w:rFonts w:ascii="Arial" w:hAnsi="Arial" w:cs="Arial"/>
               </w:rPr>
-              <w:lastRenderedPageBreak/>
               <w:t>Observer</w:t>
             </w:r>
           </w:p>
@@ -2307,6 +2319,7 @@
         <w:rPr>
           <w:rFonts w:ascii="Arial" w:hAnsi="Arial" w:cs="Arial"/>
         </w:rPr>
+        <w:lastRenderedPageBreak/>
         <w:t xml:space="preserve">Multiplicities: one </w:t>
       </w:r>
       <w:proofErr w:type="spellStart"/>
@@ -2377,14 +2390,7 @@
         <w:rPr>
           <w:rFonts w:ascii="Arial" w:hAnsi="Arial" w:cs="Arial"/>
         </w:rPr>
-        <w:t xml:space="preserve">. Every </w:t>
-      </w:r>
-      <w:r>
-        <w:rPr>
-          <w:rFonts w:ascii="Arial" w:hAnsi="Arial" w:cs="Arial"/>
-        </w:rPr>
-        <w:lastRenderedPageBreak/>
-        <w:t>abstract base with a virtual member (</w:t>
+        <w:t>. Every abstract base with a virtual member (</w:t>
       </w:r>
       <w:proofErr w:type="spellStart"/>
       <w:r>
@@ -2924,7 +2930,14 @@
         <w:rPr>
           <w:rFonts w:ascii="Arial" w:hAnsi="Arial" w:cs="Arial"/>
         </w:rPr>
-        <w:t xml:space="preserve"> collaboration with whatever sits below it (it is telling others something). These are two different one-to-many relationships with two different sets of participants, and </w:t>
+        <w:t xml:space="preserve"> collaboration with whatever sits below it (it is telling others something). These are two different one-to-many </w:t>
+      </w:r>
+      <w:r>
+        <w:rPr>
+          <w:rFonts w:ascii="Arial" w:hAnsi="Arial" w:cs="Arial"/>
+        </w:rPr>
+        <w:lastRenderedPageBreak/>
+        <w:t xml:space="preserve">relationships with two different sets of participants, and </w:t>
       </w:r>
       <w:proofErr w:type="spellStart"/>
       <w:r>
@@ -2938,14 +2951,7 @@
         <w:rPr>
           <w:rFonts w:ascii="Arial" w:hAnsi="Arial" w:cs="Arial"/>
         </w:rPr>
-        <w:t xml:space="preserve"> never plays both roles on the same edge of the tree at once, since a notice always flows strictly downward through a chain of otherwise normal Observer/Subject pairs. The dual role is exactly what the brief's own </w:t>
-      </w:r>
-      <w:r>
-        <w:rPr>
-          <w:rFonts w:ascii="Arial" w:hAnsi="Arial" w:cs="Arial"/>
-        </w:rPr>
-        <w:lastRenderedPageBreak/>
-        <w:t>scenario asks for, that "some event areas receive notifications from above and then notify interested units below."</w:t>
+        <w:t xml:space="preserve"> never plays both roles on the same edge of the tree at once, since a notice always flows strictly downward through a chain of otherwise normal Observer/Subject pairs. The dual role is exactly what the brief's own scenario asks for, that "some event areas receive notifications from above and then notify interested units below."</w:t>
       </w:r>
     </w:p>
     <w:sectPr>

</xml_diff>